<commit_message>
Remove phone number from public résumé and CV files
Redacts the phone number, its icon and separator from leo-huang-resume.pdf,
leo-huang-cv.pdf and Leo_Huang_Resume.docx, re-centers the contact line,
drops the tel: link, and replaces the template title metadata ('john smith').

Co-Authored-By: Claude Opus 5.5 <noreply@anthropic.com>
Claude-Session: https://claude.ai/code/session_01JiPE92dQgdDucWBzUJ73xZ
</commit_message>
<xml_diff>
--- a/assets/pdf/Leo_Huang_Resume.docx
+++ b/assets/pdf/Leo_Huang_Resume.docx
@@ -50,7 +50,7 @@
           <wp:anchor distT="0" distB="0" distL="114300" distR="114300" simplePos="0" relativeHeight="251671552" behindDoc="1" locked="0" layoutInCell="1" allowOverlap="1" wp14:anchorId="3ED9D73F" wp14:editId="48BDF020">
             <wp:simplePos x="0" y="0"/>
             <wp:positionH relativeFrom="column">
-              <wp:posOffset>4857115</wp:posOffset>
+              <wp:posOffset>4321175</wp:posOffset>
             </wp:positionH>
             <wp:positionV relativeFrom="paragraph">
               <wp:posOffset>12700</wp:posOffset>
@@ -113,7 +113,7 @@
           <wp:anchor distT="0" distB="0" distL="114300" distR="114300" simplePos="0" relativeHeight="251666432" behindDoc="0" locked="0" layoutInCell="1" allowOverlap="1" wp14:anchorId="7FF3331A" wp14:editId="0A51B2A8">
             <wp:simplePos x="0" y="0"/>
             <wp:positionH relativeFrom="column">
-              <wp:posOffset>3362960</wp:posOffset>
+              <wp:posOffset>2827020</wp:posOffset>
             </wp:positionH>
             <wp:positionV relativeFrom="paragraph">
               <wp:posOffset>36195</wp:posOffset>
@@ -172,74 +172,6 @@
           </wp:anchor>
         </w:drawing>
       </w:r>
-      <w:r>
-        <w:rPr>
-          <w:rFonts w:ascii="Georgia Pro" w:hAnsi="Georgia Pro"/>
-          <w:noProof/>
-        </w:rPr>
-        <w:drawing>
-          <wp:anchor distT="0" distB="0" distL="114300" distR="114300" simplePos="0" relativeHeight="251665408" behindDoc="0" locked="0" layoutInCell="1" allowOverlap="1" wp14:anchorId="3CDEB2DC" wp14:editId="2A1BD91F">
-            <wp:simplePos x="0" y="0"/>
-            <wp:positionH relativeFrom="column">
-              <wp:posOffset>335915</wp:posOffset>
-            </wp:positionH>
-            <wp:positionV relativeFrom="paragraph">
-              <wp:posOffset>30124</wp:posOffset>
-            </wp:positionV>
-            <wp:extent cx="104775" cy="104775"/>
-            <wp:effectExtent l="0" t="0" r="9525" b="9525"/>
-            <wp:wrapNone/>
-            <wp:docPr id="1648549269" name="Picture 1" descr="Receiver with solid fill"/>
-            <wp:cNvGraphicFramePr>
-              <a:graphicFrameLocks xmlns:a="http://schemas.openxmlformats.org/drawingml/2006/main" noChangeAspect="1"/>
-            </wp:cNvGraphicFramePr>
-            <a:graphic xmlns:a="http://schemas.openxmlformats.org/drawingml/2006/main">
-              <a:graphicData uri="http://schemas.openxmlformats.org/drawingml/2006/picture">
-                <pic:pic xmlns:pic="http://schemas.openxmlformats.org/drawingml/2006/picture">
-                  <pic:nvPicPr>
-                    <pic:cNvPr id="0" name="Graphic 3" descr="Receiver with solid fill"/>
-                    <pic:cNvPicPr>
-                      <a:picLocks noChangeAspect="1" noChangeArrowheads="1"/>
-                    </pic:cNvPicPr>
-                  </pic:nvPicPr>
-                  <pic:blipFill>
-                    <a:blip r:embed="rId10">
-                      <a:extLst>
-                        <a:ext uri="{28A0092B-C50C-407E-A947-70E740481C1C}">
-                          <a14:useLocalDpi xmlns:a14="http://schemas.microsoft.com/office/drawing/2010/main" val="0"/>
-                        </a:ext>
-                      </a:extLst>
-                    </a:blip>
-                    <a:srcRect r="-2083"/>
-                    <a:stretch>
-                      <a:fillRect/>
-                    </a:stretch>
-                  </pic:blipFill>
-                  <pic:spPr bwMode="auto">
-                    <a:xfrm>
-                      <a:off x="0" y="0"/>
-                      <a:ext cx="104775" cy="104775"/>
-                    </a:xfrm>
-                    <a:prstGeom prst="rect">
-                      <a:avLst/>
-                    </a:prstGeom>
-                    <a:noFill/>
-                    <a:ln>
-                      <a:noFill/>
-                    </a:ln>
-                  </pic:spPr>
-                </pic:pic>
-              </a:graphicData>
-            </a:graphic>
-            <wp14:sizeRelH relativeFrom="margin">
-              <wp14:pctWidth>0</wp14:pctWidth>
-            </wp14:sizeRelH>
-            <wp14:sizeRelV relativeFrom="margin">
-              <wp14:pctHeight>0</wp14:pctHeight>
-            </wp14:sizeRelV>
-          </wp:anchor>
-        </w:drawing>
-      </w:r>
     </w:p>
     <w:p>
       <w:pPr>
@@ -266,7 +198,7 @@
           <wp:anchor distT="0" distB="0" distL="114300" distR="114300" simplePos="0" relativeHeight="251664384" behindDoc="0" locked="0" layoutInCell="1" allowOverlap="1" wp14:anchorId="68E39095" wp14:editId="17322BF1">
             <wp:simplePos x="0" y="0"/>
             <wp:positionH relativeFrom="column">
-              <wp:posOffset>1553566</wp:posOffset>
+              <wp:posOffset>1017626</wp:posOffset>
             </wp:positionH>
             <wp:positionV relativeFrom="paragraph">
               <wp:posOffset>3810</wp:posOffset>
@@ -327,33 +259,6 @@
             </wp14:sizeRelV>
           </wp:anchor>
         </w:drawing>
-      </w:r>
-      <w:r>
-        <w:rPr>
-          <w:rFonts w:ascii="Georgia Pro" w:eastAsia="Calibri" w:hAnsi="Georgia Pro" w:cs="Times New Roman"/>
-          <w:color w:val="auto"/>
-          <w:sz w:val="20"/>
-          <w:szCs w:val="20"/>
-        </w:rPr>
-        <w:t>+1 647-300-4977</w:t>
-      </w:r>
-      <w:r>
-        <w:rPr>
-          <w:rFonts w:ascii="Georgia Pro" w:eastAsia="Calibri" w:hAnsi="Georgia Pro" w:cs="Times New Roman"/>
-          <w:color w:val="auto"/>
-          <w:sz w:val="20"/>
-          <w:szCs w:val="20"/>
-        </w:rPr>
-        <w:t xml:space="preserve"> </w:t>
-      </w:r>
-      <w:r>
-        <w:rPr>
-          <w:rFonts w:ascii="Georgia Pro" w:eastAsia="Calibri" w:hAnsi="Georgia Pro" w:cs="Times New Roman"/>
-          <w:color w:val="auto"/>
-          <w:sz w:val="20"/>
-          <w:szCs w:val="20"/>
-        </w:rPr>
-        <w:t>|</w:t>
       </w:r>
       <w:r>
         <w:rPr>

</xml_diff>

<commit_message>
Deploying to gh-pages from @ leohuang4977/leohuang4977.github.io@304f89f88ccb43ae9b264a63a2ba04c6c47a2879 🚀
</commit_message>
<xml_diff>
--- a/assets/pdf/Leo_Huang_Resume.docx
+++ b/assets/pdf/Leo_Huang_Resume.docx
@@ -50,7 +50,7 @@
           <wp:anchor distT="0" distB="0" distL="114300" distR="114300" simplePos="0" relativeHeight="251671552" behindDoc="1" locked="0" layoutInCell="1" allowOverlap="1" wp14:anchorId="3ED9D73F" wp14:editId="48BDF020">
             <wp:simplePos x="0" y="0"/>
             <wp:positionH relativeFrom="column">
-              <wp:posOffset>4857115</wp:posOffset>
+              <wp:posOffset>4321175</wp:posOffset>
             </wp:positionH>
             <wp:positionV relativeFrom="paragraph">
               <wp:posOffset>12700</wp:posOffset>
@@ -113,7 +113,7 @@
           <wp:anchor distT="0" distB="0" distL="114300" distR="114300" simplePos="0" relativeHeight="251666432" behindDoc="0" locked="0" layoutInCell="1" allowOverlap="1" wp14:anchorId="7FF3331A" wp14:editId="0A51B2A8">
             <wp:simplePos x="0" y="0"/>
             <wp:positionH relativeFrom="column">
-              <wp:posOffset>3362960</wp:posOffset>
+              <wp:posOffset>2827020</wp:posOffset>
             </wp:positionH>
             <wp:positionV relativeFrom="paragraph">
               <wp:posOffset>36195</wp:posOffset>
@@ -172,74 +172,6 @@
           </wp:anchor>
         </w:drawing>
       </w:r>
-      <w:r>
-        <w:rPr>
-          <w:rFonts w:ascii="Georgia Pro" w:hAnsi="Georgia Pro"/>
-          <w:noProof/>
-        </w:rPr>
-        <w:drawing>
-          <wp:anchor distT="0" distB="0" distL="114300" distR="114300" simplePos="0" relativeHeight="251665408" behindDoc="0" locked="0" layoutInCell="1" allowOverlap="1" wp14:anchorId="3CDEB2DC" wp14:editId="2A1BD91F">
-            <wp:simplePos x="0" y="0"/>
-            <wp:positionH relativeFrom="column">
-              <wp:posOffset>335915</wp:posOffset>
-            </wp:positionH>
-            <wp:positionV relativeFrom="paragraph">
-              <wp:posOffset>30124</wp:posOffset>
-            </wp:positionV>
-            <wp:extent cx="104775" cy="104775"/>
-            <wp:effectExtent l="0" t="0" r="9525" b="9525"/>
-            <wp:wrapNone/>
-            <wp:docPr id="1648549269" name="Picture 1" descr="Receiver with solid fill"/>
-            <wp:cNvGraphicFramePr>
-              <a:graphicFrameLocks xmlns:a="http://schemas.openxmlformats.org/drawingml/2006/main" noChangeAspect="1"/>
-            </wp:cNvGraphicFramePr>
-            <a:graphic xmlns:a="http://schemas.openxmlformats.org/drawingml/2006/main">
-              <a:graphicData uri="http://schemas.openxmlformats.org/drawingml/2006/picture">
-                <pic:pic xmlns:pic="http://schemas.openxmlformats.org/drawingml/2006/picture">
-                  <pic:nvPicPr>
-                    <pic:cNvPr id="0" name="Graphic 3" descr="Receiver with solid fill"/>
-                    <pic:cNvPicPr>
-                      <a:picLocks noChangeAspect="1" noChangeArrowheads="1"/>
-                    </pic:cNvPicPr>
-                  </pic:nvPicPr>
-                  <pic:blipFill>
-                    <a:blip r:embed="rId10">
-                      <a:extLst>
-                        <a:ext uri="{28A0092B-C50C-407E-A947-70E740481C1C}">
-                          <a14:useLocalDpi xmlns:a14="http://schemas.microsoft.com/office/drawing/2010/main" val="0"/>
-                        </a:ext>
-                      </a:extLst>
-                    </a:blip>
-                    <a:srcRect r="-2083"/>
-                    <a:stretch>
-                      <a:fillRect/>
-                    </a:stretch>
-                  </pic:blipFill>
-                  <pic:spPr bwMode="auto">
-                    <a:xfrm>
-                      <a:off x="0" y="0"/>
-                      <a:ext cx="104775" cy="104775"/>
-                    </a:xfrm>
-                    <a:prstGeom prst="rect">
-                      <a:avLst/>
-                    </a:prstGeom>
-                    <a:noFill/>
-                    <a:ln>
-                      <a:noFill/>
-                    </a:ln>
-                  </pic:spPr>
-                </pic:pic>
-              </a:graphicData>
-            </a:graphic>
-            <wp14:sizeRelH relativeFrom="margin">
-              <wp14:pctWidth>0</wp14:pctWidth>
-            </wp14:sizeRelH>
-            <wp14:sizeRelV relativeFrom="margin">
-              <wp14:pctHeight>0</wp14:pctHeight>
-            </wp14:sizeRelV>
-          </wp:anchor>
-        </w:drawing>
-      </w:r>
     </w:p>
     <w:p>
       <w:pPr>
@@ -266,7 +198,7 @@
           <wp:anchor distT="0" distB="0" distL="114300" distR="114300" simplePos="0" relativeHeight="251664384" behindDoc="0" locked="0" layoutInCell="1" allowOverlap="1" wp14:anchorId="68E39095" wp14:editId="17322BF1">
             <wp:simplePos x="0" y="0"/>
             <wp:positionH relativeFrom="column">
-              <wp:posOffset>1553566</wp:posOffset>
+              <wp:posOffset>1017626</wp:posOffset>
             </wp:positionH>
             <wp:positionV relativeFrom="paragraph">
               <wp:posOffset>3810</wp:posOffset>
@@ -327,33 +259,6 @@
             </wp14:sizeRelV>
           </wp:anchor>
         </w:drawing>
-      </w:r>
-      <w:r>
-        <w:rPr>
-          <w:rFonts w:ascii="Georgia Pro" w:eastAsia="Calibri" w:hAnsi="Georgia Pro" w:cs="Times New Roman"/>
-          <w:color w:val="auto"/>
-          <w:sz w:val="20"/>
-          <w:szCs w:val="20"/>
-        </w:rPr>
-        <w:t>+1 647-300-4977</w:t>
-      </w:r>
-      <w:r>
-        <w:rPr>
-          <w:rFonts w:ascii="Georgia Pro" w:eastAsia="Calibri" w:hAnsi="Georgia Pro" w:cs="Times New Roman"/>
-          <w:color w:val="auto"/>
-          <w:sz w:val="20"/>
-          <w:szCs w:val="20"/>
-        </w:rPr>
-        <w:t xml:space="preserve"> </w:t>
-      </w:r>
-      <w:r>
-        <w:rPr>
-          <w:rFonts w:ascii="Georgia Pro" w:eastAsia="Calibri" w:hAnsi="Georgia Pro" w:cs="Times New Roman"/>
-          <w:color w:val="auto"/>
-          <w:sz w:val="20"/>
-          <w:szCs w:val="20"/>
-        </w:rPr>
-        <w:t>|</w:t>
       </w:r>
       <w:r>
         <w:rPr>

</xml_diff>